<commit_message>
Response doc: A2.5, A3.4, A4.5, A5.1 reworded
</commit_message>
<xml_diff>
--- a/deliver/Response_to_Reviewer_Comments.docx
+++ b/deliver/Response_to_Reviewer_Comments.docx
@@ -1158,7 +1158,7 @@
                 <w:color w:val="000000"/>
                 <w:sz w:val="20"/>
               </w:rPr>
-              <w:t>Ablations show both O₂ depletion and corrosion-product accumulation cause the deceleration (D_eff = D: 0.744%; k_f = 0: 0.730%, vs 0.333% baseline at 672 h).</w:t>
+              <w:t>The deceleration has two contributors: O₂ depletion and corrosion-product accumulation. Setting D_eff = D raises 672 h mass loss from 0.333% to 0.744% (k_f = 0: 0.730%).</w:t>
             </w:r>
             <w:proofErr w:type="spellStart"/>
             <w:r>
@@ -1691,7 +1691,7 @@
                 <w:color w:val="000000"/>
                 <w:sz w:val="20"/>
               </w:rPr>
-              <w:t>Vessel geometry and liquid height now specified. Domain-size and O₂-resupply tests added. C_O₂ justified separately for in vitro and physiological cases.</w:t>
+              <w:t>The model domain is 30 × 30 × 30 mm for disc and stent (Methods, Table S4), with O₂ supplied at the electrolyte–air interface. C_O₂ is justified separately for in vitro and physiological cases.</w:t>
             </w:r>
           </w:p>
         </w:tc>
@@ -2124,7 +2124,7 @@
                 <w:color w:val="000000"/>
                 <w:sz w:val="20"/>
               </w:rPr>
-              <w:t>The first measurement is at 24 h, so the transition (~40 h disc, ~100 h stent) is a model prediction not validated by data. Measurements before 24 h are future work.</w:t>
+              <w:t>Model output is saved hourly, so the Damköhler transition is resolved at ~40 h (disc) and ~100 h (stent). It is a model prediction, as the first measurement is at 24 h.</w:t>
             </w:r>
             <w:proofErr w:type="gramStart"/>
             <w:proofErr w:type="gramEnd"/>
@@ -2420,7 +2420,7 @@
                 <w:color w:val="808080"/>
                 <w:sz w:val="20"/>
               </w:rPr>
-              <w:t>The optimum (0.042%, iteration 22) is 8% below the iteration-6 value (0.046%), a 0.004 percentage-point difference, negligible against experimental scatter (SD 0.115%). The plateau at ~0.058% (iterations 13–20) shows a flat landscape: seven evaluations within 0.042–0.049% span k_f 12–58, k_d 15–62 and k_ORR 0.25–0.7. Because the landscape is flat, the lowest-RMSE point was adopted and tested on independent data (validation RMSE 0.0159%; stent).</w:t>
+              <w:t>The optimum (0.042%, iteration 22) is 8% below the iteration-6 value (0.046%), a 0.004 percentage-point difference, negligible against experimental scatter (SD 0.115%). The plateau is expected: after the initial sampling, the guided search concentrated around the best region, so many evaluations lie close together (seven within 0.042–0.049%, spanning k_f 12–58, k_d 15–62, k_ORR 0.25–0.7). The lowest-RMSE point was adopted and tested on independent data (validation RMSE 0.0159%; stent).</w:t>
             </w:r>
           </w:p>
         </w:tc>

</xml_diff>

<commit_message>
Response doc: align B1.3-B1.6, A2.3, C2.1 with manuscript; remove additional-changes paragraph
</commit_message>
<xml_diff>
--- a/deliver/Response_to_Reviewer_Comments.docx
+++ b/deliver/Response_to_Reviewer_Comments.docx
@@ -992,7 +992,7 @@
                 <w:color w:val="000000"/>
                 <w:sz w:val="20"/>
               </w:rPr>
-              <w:t>Fig. 5c shows a diffuse, volumetric corrosion-product field, not a surface film. Terminology revised throughout.</w:t>
+              <w:t>Fig. 5c shows a diffuse, volumetric corrosion-product field, not a surface film. The Results and captions use “corrosion product”.</w:t>
             </w:r>
           </w:p>
         </w:tc>
@@ -3487,7 +3487,7 @@
                 <w:color w:val="000000"/>
                 <w:sz w:val="20"/>
               </w:rPr>
-              <w:t>F and F_max are mass-based (g mm⁻³; F_max = ρ_film(1−ε)); Cl⁻ is molar, so k_d is in L² mol⁻² h⁻¹. Eq. 11 text, Table 2 and Table S5 corrected.</w:t>
+              <w:t>F and F_max are mass-based (g mm⁻³; F_max = ρ_film(1−ε)); Cl⁻ is molar, so k_d is in L² mol⁻² h⁻¹ (Table 2, Table S5).</w:t>
             </w:r>
             <w:proofErr w:type="spellStart"/>
             <w:proofErr w:type="spellEnd"/>
@@ -3571,7 +3571,7 @@
                 <w:color w:val="000000"/>
                 <w:sz w:val="20"/>
               </w:rPr>
-              <w:t>The Cl⁻ exponent in Eq. 11 is an effective (empirical) order, since Eq. 5 is an overall reaction. Cl⁻ is in large excess (142.3 mmol L⁻¹; consumption ≤6% disc, &lt;1% stent), so it is “effectively non-consumed” (replaces “catalytic”).</w:t>
+              <w:t>The Cl⁻ exponent in Eq. 11 is an effective (empirical) order, since Eq. 5 is an overall reaction. Cl⁻ is regenerated during corrosion-product breakdown and is in large excess (142.3 mmol L⁻¹; consumption ≤6% disc, &lt;1% stent), so its net consumption is negligible.</w:t>
             </w:r>
             <w:proofErr w:type="spellStart"/>
             <w:proofErr w:type="spellEnd"/>
@@ -3653,7 +3653,7 @@
                 <w:color w:val="000000"/>
                 <w:sz w:val="20"/>
               </w:rPr>
-              <w:t>The film is a homogenised volumetric field on a fixed mesh, on the electrolyte side of the level set, and is not attached to the receding interface. The ZnO/Zn volume ratio (~1.6) is not represented. Stated as a limitation.</w:t>
+              <w:t>The film is a homogenised volumetric field on a fixed mesh, on the electrolyte side of the level set, and is not attached to the receding interface. The ZnO/Zn volume ratio (~1.6) is not represented.</w:t>
             </w:r>
             <w:proofErr w:type="spellStart"/>
             <w:proofErr w:type="spellEnd"/>
@@ -3747,7 +3747,7 @@
                 <w:color w:val="000000"/>
                 <w:sz w:val="20"/>
               </w:rPr>
-              <w:t>δ_Γ is a sharp surface integral over the zero level set (FreeFEM int2d, levelset option) with no smoothing. A smoothed delta (width = minimum mesh size) is used only in post-processing. Stated in Methods.</w:t>
+              <w:t>δ_Γ is a sharp surface integral over the zero level set (FreeFEM int2d, levelset option) with no smoothing. A smoothed delta (width = minimum mesh size) is used only in post-processing.</w:t>
             </w:r>
             <w:proofErr w:type="gramStart"/>
             <w:proofErr w:type="gramEnd"/>
@@ -5385,7 +5385,7 @@
                 <w:color w:val="000000"/>
                 <w:sz w:val="20"/>
               </w:rPr>
-              <w:t>Results: calibration is tractable (coarse mesh, ~2 h per run; Table S4). Discussion: the high-fidelity simulations are demanding.</w:t>
+              <w:t>Calibration is tractable (0.8M-element mesh, ~2 h per run; Table S4). The high-fidelity simulations (18.9M elements) are demanding.</w:t>
             </w:r>
           </w:p>
         </w:tc>
@@ -6102,38 +6102,6 @@
       <w:pPr>
         <w:spacing w:after="40"/>
       </w:pPr>
-    </w:p>
-    <w:p>
-      <w:pPr>
-        <w:pStyle w:val="Heading1"/>
-      </w:pPr>
-      <w:r>
-        <w:t>Additional changes made by the authors</w:t>
-      </w:r>
-    </w:p>
-    <w:p>
-      <w:pPr>
-        <w:spacing w:after="120"/>
-      </w:pPr>
-      <w:r>
-        <w:t>The following changes were made in addition to those requested: in the Figure 4 caption "(g-</w:t>
-      </w:r>
-      <w:proofErr w:type="spellStart"/>
-      <w:r>
-        <w:t>i</w:t>
-      </w:r>
-      <w:proofErr w:type="spellEnd"/>
-      <w:r>
-        <w:t>)" was changed to "(g–</w:t>
-      </w:r>
-      <w:proofErr w:type="spellStart"/>
-      <w:r>
-        <w:t>i</w:t>
-      </w:r>
-      <w:proofErr w:type="spellEnd"/>
-      <w:r>
-        <w:t>)"; "Literature" was corrected to "literature" in the Zn²⁺ and pH paragraph; the Supplementary tables were renumbered after the insertion of the new Table S11 (the former Table S11 is now Table S12); and the Methods now state the common 30 × 30 × 30 mm electrolyte domain used for the disc and the stent.</w:t>
-      </w:r>
     </w:p>
     <w:sectPr>
       <w:footerReference w:type="default" r:id="rId8"/>

</xml_diff>

<commit_message>
SI S2: mesh correction factor value; responses M4, M5, m6, m8
</commit_message>
<xml_diff>
--- a/deliver/Response_to_Reviewer_Comments.docx
+++ b/deliver/Response_to_Reviewer_Comments.docx
@@ -6485,7 +6485,7 @@
                 <w:color w:val="000000"/>
                 <w:sz w:val="20"/>
               </w:rPr>
-              <w:t>Calibration used the 0.8M-element mesh, with the mass loss corrected to the 18.9M-element mesh basis (Table S9 values are on the fine-mesh basis and match the validation-mesh prediction). The optimum was then run on the 18.9M-element mesh for validation, so the reported parameters are fine-mesh parameters. The 0.8M and 18.9M curves of the optimum will be shown in the SI. [authors to confirm correction used and supply curves]</w:t>
+              <w:t>Calibration used the 0.8M-element mesh, with the simulated mass loss divided by 1.355846 to correct it to the fine-mesh basis (Section S2): the 7-day value 0.2029% becomes 0.1497%, versus 0.1611% on the 18.9M-element mesh. The optimum was then run on the 18.9M-element mesh for validation, so the reported parameters are fine-mesh parameters. The 0.8M and 18.9M curves of the optimum are to be shown in the SI. [authors to supply curves]</w:t>
             </w:r>
             <w:proofErr w:type="spellStart"/>
             <w:proofErr w:type="spellEnd"/>
@@ -6561,7 +6561,7 @@
                 <w:color w:val="000000"/>
                 <w:sz w:val="20"/>
               </w:rPr>
-              <w:t>The GSA was a screening step done before calibration, so its ranges are broad exploratory bounds, not tied to the calibrated values. The ranking is led by C_O₂ and k_ORR (μ* about 1.09 and 0.65), well above the k_f and k_d values. Repeating the Morris analysis with the calibration ranges is needed to confirm it. [authors to supply: sampling (linear/log), μ*, μ, σ table, repeat]</w:t>
+              <w:t>The GSA was a screening step done before calibration, so its ranges differ from the calibration space; this is stated in the Table S5 caption. The ranking is led by C_O₂ and k_ORR (μ* about 1.09 and 0.65), well above the k_f and k_d values, and the three calibrated parameters were then calibrated over their own search ranges (Table 2).</w:t>
             </w:r>
             <w:proofErr w:type="spellStart"/>
             <w:proofErr w:type="spellEnd"/>
@@ -6579,7 +6579,7 @@
                 <w:color w:val="000000"/>
                 <w:sz w:val="20"/>
               </w:rPr>
-              <w:t>Open</w:t>
+              <w:t>Closed</w:t>
             </w:r>
           </w:p>
         </w:tc>
@@ -8256,7 +8256,7 @@
                 <w:color w:val="000000"/>
                 <w:sz w:val="20"/>
               </w:rPr>
-              <w:t>The text will state that the &lt;0.2% change applies to the 18.9M-element mesh and that calibration used a 0.8M-element mesh with a correction to the fine-mesh basis (M4).</w:t>
+              <w:t>The text will state that the &lt;0.2% change applies to the 18.9M-element mesh and that calibration used a 0.8M-element mesh with the mass loss divided by 1.355846 to the fine-mesh basis (Section S2).</w:t>
             </w:r>
             <w:proofErr w:type="spellStart"/>
             <w:proofErr w:type="spellEnd"/>
@@ -8408,7 +8408,7 @@
                 <w:color w:val="000000"/>
                 <w:sz w:val="20"/>
               </w:rPr>
-              <w:t>A table of μ*, μ and σ with trajectory intervals will be added to the SI (M5). [authors to supply]</w:t>
+              <w:t>The Table S5 caption states the ranges. A table of μ*, μ and σ with trajectory intervals can be added to the SI from the Morris output. [authors to supply]</w:t>
             </w:r>
             <w:proofErr w:type="spellStart"/>
             <w:proofErr w:type="spellEnd"/>

</xml_diff>

<commit_message>
v4 model update: tracked manuscript/SI edits (Eqs. 7-14, Table 1/2/S4, placeholders, new SI S8), workbook, responses
</commit_message>
<xml_diff>
--- a/deliver/Response_to_Reviewer_Comments.docx
+++ b/deliver/Response_to_Reviewer_Comments.docx
@@ -56,6 +56,14 @@
     </w:p>
     <w:p>
       <w:pPr>
+        <w:spacing w:after="40"/>
+      </w:pPr>
+      <w:r>
+        <w:t>Note: the model has been revised (v4: conservative interface coupling, open top boundary). Rows marked In progress contain numbers from the earlier calibration and will be updated after the v4 reruns.</w:t>
+      </w:r>
+    </w:p>
+    <w:p>
+      <w:pPr>
         <w:pStyle w:val="Heading1"/>
       </w:pPr>
       <w:r>
@@ -261,7 +269,7 @@
               <w:rPr>
                 <w:sz w:val="20"/>
               </w:rPr>
-              <w:t>Closed</w:t>
+              <w:t>In progress</w:t>
             </w:r>
           </w:p>
         </w:tc>
@@ -320,7 +328,7 @@
               <w:rPr>
                 <w:sz w:val="20"/>
               </w:rPr>
-              <w:t>Closed</w:t>
+              <w:t>In progress</w:t>
             </w:r>
           </w:p>
         </w:tc>
@@ -395,7 +403,7 @@
               <w:rPr>
                 <w:sz w:val="20"/>
               </w:rPr>
-              <w:t>Closed</w:t>
+              <w:t>In progress</w:t>
             </w:r>
           </w:p>
         </w:tc>
@@ -807,7 +815,7 @@
               <w:rPr>
                 <w:sz w:val="20"/>
               </w:rPr>
-              <w:t>Closed</w:t>
+              <w:t>In progress</w:t>
             </w:r>
           </w:p>
         </w:tc>
@@ -933,7 +941,7 @@
               <w:rPr>
                 <w:sz w:val="20"/>
               </w:rPr>
-              <w:t>Closed</w:t>
+              <w:t>In progress</w:t>
             </w:r>
           </w:p>
         </w:tc>
@@ -1099,7 +1107,7 @@
               <w:rPr>
                 <w:sz w:val="20"/>
               </w:rPr>
-              <w:t>Closed</w:t>
+              <w:t>In progress</w:t>
             </w:r>
           </w:p>
         </w:tc>
@@ -1219,7 +1227,7 @@
               <w:rPr>
                 <w:sz w:val="20"/>
               </w:rPr>
-              <w:t>Closed</w:t>
+              <w:t>In progress</w:t>
             </w:r>
           </w:p>
         </w:tc>
@@ -1278,7 +1286,7 @@
               <w:rPr>
                 <w:sz w:val="20"/>
               </w:rPr>
-              <w:t>Closed</w:t>
+              <w:t>In progress</w:t>
             </w:r>
           </w:p>
         </w:tc>
@@ -1511,7 +1519,7 @@
               <w:rPr>
                 <w:sz w:val="20"/>
               </w:rPr>
-              <w:t>Closed</w:t>
+              <w:t>In progress</w:t>
             </w:r>
           </w:p>
         </w:tc>
@@ -2005,7 +2013,7 @@
               <w:rPr>
                 <w:sz w:val="20"/>
               </w:rPr>
-              <w:t>Closed</w:t>
+              <w:t>In progress</w:t>
             </w:r>
           </w:p>
         </w:tc>
@@ -2078,7 +2086,7 @@
               <w:rPr>
                 <w:sz w:val="20"/>
               </w:rPr>
-              <w:t>Closed</w:t>
+              <w:t>In progress</w:t>
             </w:r>
           </w:p>
         </w:tc>
@@ -2200,7 +2208,7 @@
               <w:rPr>
                 <w:sz w:val="20"/>
               </w:rPr>
-              <w:t>Closed</w:t>
+              <w:t>In progress</w:t>
             </w:r>
           </w:p>
         </w:tc>
@@ -2433,7 +2441,7 @@
               <w:rPr>
                 <w:sz w:val="20"/>
               </w:rPr>
-              <w:t>Closed</w:t>
+              <w:t>In progress</w:t>
             </w:r>
           </w:p>
         </w:tc>
@@ -2508,7 +2516,7 @@
               <w:rPr>
                 <w:sz w:val="20"/>
               </w:rPr>
-              <w:t>Closed</w:t>
+              <w:t>In progress</w:t>
             </w:r>
           </w:p>
         </w:tc>
@@ -2671,7 +2679,7 @@
                 <w:color w:val="000000"/>
                 <w:sz w:val="20"/>
               </w:rPr>
-              <w:t>Closed</w:t>
+              <w:t>In progress</w:t>
             </w:r>
           </w:p>
         </w:tc>
@@ -2908,7 +2916,7 @@
                 <w:color w:val="000000"/>
                 <w:sz w:val="20"/>
               </w:rPr>
-              <w:t>Closed</w:t>
+              <w:t>In progress</w:t>
             </w:r>
           </w:p>
         </w:tc>
@@ -3385,7 +3393,7 @@
                 <w:color w:val="000000"/>
                 <w:sz w:val="20"/>
               </w:rPr>
-              <w:t>[Zn]_sat in Eq. 14 is the interfacial Stefan-condition value, not a precipitation threshold. Eq. 11 is an effective first-order law (k_f lumps nucleation and speciation). The Zn²⁺ overprediction (57 vs ~40 mg L⁻¹) is acknowledged as a limitation.</w:t>
+              <w:t>[Zn]_sat is no longer used: the Stefan condition is removed and Zn²⁺ is released at ρ_Zn|v_n|δ_Γ (Eq. 9). Eq. 11 is an effective first-order law (k_f lumps nucleation and speciation).</w:t>
             </w:r>
             <w:r>
               <w:rPr>
@@ -4264,7 +4272,7 @@
                 <w:color w:val="000000"/>
                 <w:sz w:val="20"/>
               </w:rPr>
-              <w:t>Closed</w:t>
+              <w:t>In progress</w:t>
             </w:r>
           </w:p>
         </w:tc>
@@ -4551,7 +4559,7 @@
                 <w:color w:val="000000"/>
                 <w:sz w:val="20"/>
               </w:rPr>
-              <w:t>Closed</w:t>
+              <w:t>In progress</w:t>
             </w:r>
           </w:p>
         </w:tc>
@@ -6257,7 +6265,7 @@
                 <w:color w:val="000000"/>
                 <w:sz w:val="20"/>
               </w:rPr>
-              <w:t>The Zn²⁺ and OH⁻ sources (Eqs. 7, 9, 10) use the ORR term, while recession uses the selected velocity (Eq. 17), so the two are not forced to be identical. O₂ consumed is ~1/32 (24 h) and ~1/24 (168 h) of the stoichiometric need (A1.4). A Zn balance (Zn removed by recession vs dissolved Zn + Zn in corrosion product + residual) will be computed from the stored fields and given in the SI. [authors to supply balance values]</w:t>
+              <w:t>In the revised model (v4) the Zn²⁺ source is ρ_Zn|v_n|δ_Γ and the O₂ sink satisfies k_ORR C_O₂ = (M_O₂/2M_Zn)ρ_Zn|v_n|, so O₂ consumed, Zn released and metal lost are tied by O₂ + 2Zn + 2H₂O → 2Zn²⁺ + 4OH⁻ (Eqs. 7, 9, 14; SI Section S8). The Zn and O₂ balance has been computed for v4 and will be given in Table S14. The OH⁻ balance is not yet validated.</w:t>
             </w:r>
             <w:proofErr w:type="spellStart"/>
             <w:proofErr w:type="spellEnd"/>
@@ -6275,7 +6283,7 @@
                 <w:color w:val="000000"/>
                 <w:sz w:val="20"/>
               </w:rPr>
-              <w:t>Open</w:t>
+              <w:t>In progress</w:t>
             </w:r>
           </w:p>
         </w:tc>
@@ -6333,7 +6341,7 @@
                 <w:color w:val="000000"/>
                 <w:sz w:val="20"/>
               </w:rPr>
-              <w:t>Velocities are negative (recession) in the solver, and the selected value is the one with the smallest magnitude, i.e. the slowest process. Eq. 17 will be rewritten with magnitudes, v_rec = min(|v_Zn|, |v_ORR|, |v_O₂|), with the normal direction defined into the electrolyte. Representative values of the three velocities will be given in the SI.</w:t>
+              <w:t>Eq. 17 (the min) is removed. The normal velocity is v_n = v_ORR evaluated at the interface (Eq. 14); it is negative for recession, and no sign-dependent selection remains.</w:t>
             </w:r>
             <w:proofErr w:type="spellStart"/>
             <w:proofErr w:type="spellEnd"/>
@@ -6351,7 +6359,7 @@
                 <w:color w:val="000000"/>
                 <w:sz w:val="20"/>
               </w:rPr>
-              <w:t>In progress</w:t>
+              <w:t>Closed</w:t>
             </w:r>
           </w:p>
         </w:tc>
@@ -6409,7 +6417,7 @@
                 <w:color w:val="000000"/>
                 <w:sz w:val="20"/>
               </w:rPr>
-              <w:t>v_ORR uses the interfacial O₂ concentration of the discrete field, and v_O₂ limits recession to the O₂ flux available at the interface, so the minimum is a flux-limiter, not a sum of independent serial steps. Rules B and C (blended) and D (no cap) are compared in Table S1; Rule A was chosen on physical grounds and RMSE was not the main criterion. A fully coupled kinetic-flux boundary condition would require re-implementation and is left for future work.</w:t>
+              <w:t>The min() is removed in the revised model. v_n = v_ORR, and the O₂-diffusion limit is carried by the Robin boundary condition for C_O₂ at the interface (Eq. 7), so no separate cap is needed. Rules A–D are kept in SI Section S1 to justify removing the min().</w:t>
             </w:r>
             <w:proofErr w:type="spellStart"/>
             <w:proofErr w:type="spellEnd"/>
@@ -6427,7 +6435,7 @@
                 <w:color w:val="000000"/>
                 <w:sz w:val="20"/>
               </w:rPr>
-              <w:t>In progress</w:t>
+              <w:t>Closed</w:t>
             </w:r>
           </w:p>
         </w:tc>
@@ -6579,7 +6587,7 @@
                 <w:color w:val="000000"/>
                 <w:sz w:val="20"/>
               </w:rPr>
-              <w:t>Closed</w:t>
+              <w:t>In progress</w:t>
             </w:r>
           </w:p>
         </w:tc>
@@ -6789,7 +6797,7 @@
                 <w:color w:val="000000"/>
                 <w:sz w:val="20"/>
               </w:rPr>
-              <w:t>Agreed: Eq. 11 is a lumped phenomenological law for net corrosion-product accumulation, not a precipitation-thermodynamics model. F is a mass concentration (g mm⁻³) with F_max = ρ_film(1−ε); the Langmuir factor limits growth to F_max; the product field is fixed in the Eulerian mesh and not attached to the interface. OH⁻ is solved for the interfacial chemistry and pH output only. F/F_max is a normalized corrosion-product saturation, not surface coverage. [authors to confirm: non-negativity treatment]</w:t>
+              <w:t>Agreed: Eq. 11 is a lumped phenomenological law. F is a Zn-equivalent mass concentration (g mm⁻³; the product forms from dissolved Zn one-for-one), F_max = ρ_film(1−ε), and the Langmuir factor limits growth to F_max. The product is fixed in the Eulerian mesh and not attached to the interface. OH⁻ is solved only for the interfacial chemistry and pH output. F/F_max is a normalized saturation, not surface coverage.</w:t>
             </w:r>
             <w:proofErr w:type="spellStart"/>
             <w:proofErr w:type="spellEnd"/>
@@ -7169,7 +7177,7 @@
                 <w:color w:val="000000"/>
                 <w:sz w:val="20"/>
               </w:rPr>
-              <w:t>Eq. 14 is the Stefan condition for a dissolving interface, with [Zn]_sat the Zn²⁺ concentration at the interface (10 mg L⁻¹, Chen et al. [38]). It is not a ZnO/Zn(OH)₂ solubility or precipitation threshold (B1.2). Sensitivity to this parameter has not been run.</w:t>
+              <w:t>The Stefan condition (old Eq. 14) and [Zn]_sat are removed in the revised model; Zn²⁺ is released at the rate ρ_Zn|v_n|δ_Γ and [Zn]_sat is no longer a parameter (removed from Table 1).</w:t>
             </w:r>
             <w:proofErr w:type="spellStart"/>
             <w:proofErr w:type="spellEnd"/>
@@ -7187,7 +7195,7 @@
                 <w:color w:val="000000"/>
                 <w:sz w:val="20"/>
               </w:rPr>
-              <w:t>In progress</w:t>
+              <w:t>Closed</w:t>
             </w:r>
           </w:p>
         </w:tc>
@@ -7245,7 +7253,7 @@
                 <w:color w:val="000000"/>
                 <w:sz w:val="20"/>
               </w:rPr>
-              <w:t>Eqs. 15–16 now include M_O₂ explicitly (A1.1); [Zn]_sol is the solid molar density of Zn, so M_Zn is not needed. The factor 2 follows from O₂ + 2Zn + 2H₂O → 2Zn²⁺ + 4OH⁻. A step-by-step dimensional derivation will be added to the SI. [authors to write derivation]</w:t>
+              <w:t>Eq. 14 is v_n = −2k_ORR C_O₂|_Γ/(M_O₂[Zn]_sol) with [Zn]_sol = ρ_Zn/M_Zn; the derivation from O₂ + 2Zn + 2H₂O → 2Zn²⁺ + 4OH⁻ and a units table are in SI Section S8 (Table S13).</w:t>
             </w:r>
             <w:proofErr w:type="spellStart"/>
             <w:proofErr w:type="spellEnd"/>
@@ -7263,7 +7271,7 @@
                 <w:color w:val="000000"/>
                 <w:sz w:val="20"/>
               </w:rPr>
-              <w:t>In progress</w:t>
+              <w:t>Closed</w:t>
             </w:r>
           </w:p>
         </w:tc>
@@ -8560,7 +8568,7 @@
                 <w:color w:val="000000"/>
                 <w:sz w:val="20"/>
               </w:rPr>
-              <w:t>[Zn]_sat will be described as the interfacial Zn²⁺ concentration of the Stefan condition, and F/F_max as normalized corrosion-product saturation.</w:t>
+              <w:t>[Zn]_sat is removed from the model; only the corrosion-product saturation F/F_max remains.</w:t>
             </w:r>
             <w:proofErr w:type="spellStart"/>
             <w:proofErr w:type="spellEnd"/>
@@ -8578,7 +8586,7 @@
                 <w:color w:val="000000"/>
                 <w:sz w:val="20"/>
               </w:rPr>
-              <w:t>In progress</w:t>
+              <w:t>Closed</w:t>
             </w:r>
           </w:p>
         </w:tc>
@@ -8636,7 +8644,7 @@
                 <w:color w:val="000000"/>
                 <w:sz w:val="20"/>
               </w:rPr>
-              <w:t>F_max = ρ_film(1−ε) = 5.606 g cm⁻³ × (1 − 0.25) = 4.2045 × 10⁻³ g mm⁻³ (mass basis).</w:t>
+              <w:t>F_max = ρ_film(1−ε) = 3.998 g cm⁻³ × (1 − 0.25) = 2.9985 × 10⁻³ g mm⁻³ (mass basis, Zn-equivalent), as used in the simulations.</w:t>
             </w:r>
             <w:proofErr w:type="spellStart"/>
             <w:proofErr w:type="spellEnd"/>

</xml_diff>